<commit_message>
Add EICV-RAG paper section, pedagogical concepts doc, and fresh reproduction run
Adds Section 3.8 (EICV-RAG: claim-level evidence verification, scoped
built-vs-deferred) and a closing-conclusion mention of the production
deployment to the research paper, renumbers tables accordingly, and adds
docs/learn/CONCEPTS_FROM_SCRATCH_TO_ADVANCED.{md,docx,pdf} -- a from-
scratch-to-advanced explainer covering every concept in the pipeline
(chunking/OCR, BM25, dense retrieval, RRF, reranking, evaluation
methodology, EAR, RVQ, EICV-RAG, production deployment). Also includes a
fresh, timestamped re-run of the project's own benchmark/RVQ/OCR-
robustness scripts from this consolidated folder, confirming reproducibility.

Co-Authored-By: Claude Sonnet 5 <noreply@anthropic.com>
</commit_message>
<xml_diff>
--- a/research/PUBLICATION_PACKAGE/QuIM_EAR_Revalidation_Paper.docx
+++ b/research/PUBLICATION_PACKAGE/QuIM_EAR_Revalidation_Paper.docx
@@ -740,7 +740,7 @@
     </w:p>
     <w:p>
       <w:r>
-        <w:t>Section 5.2's headline comparison (coverage, accuracy-on-answered, baseline accuracy, a single bootstrap CI) describes EAR's behavior at exactly one operating point — the specific θ_abstain/θ_answer pair the calibration fit happened to choose (Table 4). This is the standard selective-prediction reporting format, but it conflates two separate questions that matter for different reasons: (a) is the sufficiency score p itself a useful ranking signal for query difficulty, independent of where any particular threshold is drawn, and (b) did this particular fitted threshold choice land in a good place on that ranking. A system can have an informative score and still ship a poorly-chosen operating threshold, or vice versa — the single-point result in Section 5.2 cannot distinguish these. We therefore add four threshold-independent or complementary diagnostics, standard in the selective-prediction literature but not previously applied to EAR in any draft of this project, each introduced with the specific reason it is the right tool for what it measures here.</w:t>
+        <w:t>Section 5.2's headline comparison (coverage, accuracy-on-answered, baseline accuracy, a single bootstrap CI) describes EAR's behavior at exactly one operating point — the specific θ_abstain/θ_answer pair the calibration fit happened to choose (Table 5). This is the standard selective-prediction reporting format, but it conflates two separate questions that matter for different reasons: (a) is the sufficiency score p itself a useful ranking signal for query difficulty, independent of where any particular threshold is drawn, and (b) did this particular fitted threshold choice land in a good place on that ranking. A system can have an informative score and still ship a poorly-chosen operating threshold, or vice versa — the single-point result in Section 5.2 cannot distinguish these. We therefore add four threshold-independent or complementary diagnostics, standard in the selective-prediction literature but not previously applied to EAR in any draft of this project, each introduced with the specific reason it is the right tool for what it measures here.</w:t>
       </w:r>
     </w:p>
     <w:p>
@@ -1370,84 +1370,56 @@
     </w:p>
     <w:p>
       <w:pPr>
-        <w:pStyle w:val="Heading1"/>
-      </w:pPr>
-      <w:r>
-        <w:t>4. Experimental Setup</w:t>
+        <w:pStyle w:val="Heading2"/>
+      </w:pPr>
+      <w:r>
+        <w:t>3.8 EICV-RAG: A Claim-Level Evidence Verification Layer</w:t>
       </w:r>
     </w:p>
     <w:p>
-      <w:pPr>
-        <w:pStyle w:val="Heading2"/>
-      </w:pPr>
-      <w:r>
-        <w:t>4.1 Dataset</w:t>
+      <w:r>
+        <w:t>A further pass added a claim-level verification layer on top of the production backend described in Section 3.6 (docs/production/EICV_RAG.md carries the full scoped-vs-deferred breakdown; this section summarizes it for the paper). The motivating brief specified an 18-part research program -- an evidence lineage graph database, 7 counterfactual test types, a 10-signal learned integrity score compared across 5 model variants, an adaptive verification-budget optimizer, and a dedicated literature review -- that is genuinely multi-week, multi-person scope. Consistent with this paper's standing discipline (evidence first, scope stated honestly, nothing silently dropped), what was actually built and verified is a deliberately scoped subset, stated here as built vs. deferred rather than claimed in full.</w:t>
       </w:r>
     </w:p>
     <w:p>
-      <w:r>
-        <w:t>QuIM-RAG's own evaluation corpus (22,609 GPT-3.5-generated questions over a scraped NDSU university-catalog and career-advising corpus) is private with no public release, no code repository, and no stated data license — confirmed unreachable, not merely assumed, during this project's audit of the original paper (Section 2). A substitute public benchmark is therefore required for any retrieval- or selective-prediction-level claim in this paper, and the choice of substitute is not incidental: it determines what can and cannot be tested about EAR's four signals. We selected OHR-Bench (Zhang et al., arXiv:2412.02592, ICCV 2025) over four other candidates for reasons specific to what each of EAR's signals needs to be exercised meaningfully, not merely because it is a convenient, well-known benchmark.</w:t>
+      <w:pPr>
+        <w:pStyle w:val="Heading3"/>
+      </w:pPr>
+      <w:r>
+        <w:t>3.8.1 What was built and verified</w:t>
       </w:r>
     </w:p>
     <w:p>
-      <w:pPr>
-        <w:pStyle w:val="Heading3"/>
-      </w:pPr>
-      <w:r>
-        <w:t>4.1.1 What OHR-Bench actually contains</w:t>
+      <w:r>
+        <w:t>Claim-level attribution (backend/claim_verification.py): a previously-generated answer is decomposed into atomic claims via the same two-step, context-hidden-first extraction pattern already proven in quimrag/ragas_eval.py (which avoids a documented failure mode where a small local judge lists context sentences as claims when shown context and answer together), then each claim is independently attributed to the specific evidence chunk_id(s) that support it. This is a strict superset of the existing citation-marker check (backend/citations.py), which only confirms a [C12]-style marker resolves to a real chunk, not that the chunk actually supports the claim attached to it -- EICV's attribution step independently re-derives support and therefore also catches a citation that resolves correctly but does not support its claim.</w:t>
       </w:r>
     </w:p>
     <w:p>
       <w:r>
-        <w:t>OHR-Bench ships 8,500+ unstructured PDF pages across 7 domains (Textbook, Law, Finance, Newspaper, Manual, Academic, Administration), each page paired with human-verified ground-truth structured text, and 8,498 question-answer pairs (file qas_v2.json) drawn from 1,117 unique source documents. Each QA record carries an evidence_source field tagging which of five OCR-difficulty categories the question's supporting evidence comes from — plain text (3,409 records, 40%), table (2,275, 27%), formula (1,223, 14%), chart (765, 9%), or reading-order-dependent content (691, 8%) — and an answer_form field, of which 2,980 records (35%) are Numeric. This paper uses six of the seven domains (law, finance, textbook, manual, academic, news), substituting "academic" for the original sampling plan's "paper" label after confirming qas_v2.json's own taxonomy has zero records under "paper" (Section 3.3); "administration" is available but not used, to keep the domain-set size comparable to prior work's six-domain design.</w:t>
+        <w:t>One counterfactual test (of the seven specified; the other six are named, scoped follow-ups, not silently dropped -- see the deferral table below): evidence deletion. For each SUPPORTED claim, its supporting chunk(s) are removed and the attribution judge is re-run on the reduced evidence set. A real, repeatable flip from SUPPORTED to UNSUPPORTED was observed when a claim's sole supporting chunk was removed -- reported, per the module's own stated caveat, as a diagnostic signal of evidence dependence, not as proof of correctness or hallucination; the unchanged-support case is captioned in the UI as possibly redundant evidence or the model's own prior knowledge, not as a pass/fail verdict.</w:t>
       </w:r>
     </w:p>
     <w:p>
-      <w:pPr>
-        <w:pStyle w:val="Heading3"/>
-      </w:pPr>
-      <w:r>
-        <w:t>4.1.2 Why this schema matters for EAR specifically, not just as a generic QA benchmark</w:t>
+      <w:r>
+        <w:t>A real correctness bug was found and fixed during this pass's own manual verification, not assumed: after a process restart, SQLite still reported a document's status as ready while the in-process retrieval index -- which lives only in memory -- was actually empty, so a document could appear retrievable while genuinely not being so. Fixed with rebuild_index_from_storage(), invoked at backend startup; verified by killing and restarting the server and observing chunks_indexed go 1 -&gt; 0 -&gt; 1 across the restart, with /ask working immediately afterward with no manual re-upload. Covered by a new regression test (tests/test_backend_api.py::test_restart_recovery_rebuilds_index_from_storage).</w:t>
       </w:r>
     </w:p>
     <w:p>
-      <w:pPr>
-        <w:pStyle w:val="ListBullet"/>
-      </w:pPr>
-      <w:r>
-        <w:t>The contradiction signal (Eq. 4) extracts and compares numbers across evidence chunks — it has essentially nothing to detect on a benchmark without numeric content. OHR-Bench's 2,980 Numeric-answer records and 2,275 table-evidence records (table rows are a dense source of the kind of near-duplicate, easily-transposed figures this signal targets) give it real material to work with; a benchmark like SQuAD, built from prose Wikipedia passages, would not.</w:t>
+      <w:r>
+        <w:t>The frontend (frontend/index.html) was rebuilt as a single-page chat interface -- a collapsible sidebar with persisted conversation history, citation-linked answers, an EAR decision badge, and expandable Sources / Claim-level Verification panels (verification is opt-in per query, the adaptive-verification-budget principle in lightweight form: cheap EAR routing runs on every query, the more expensive multi-call verification only runs on request). This was verified by actually driving it through the Claude Browser pane tooling -- a file injected via DataTransfer (no native file picker in that environment), each Upload/Ask/Verify/Delete action clicked and its resulting state change confirmed via DOM inspection and screenshots, not asserted from the source alone. Two real bugs were found and fixed during that verification itself: an overlay sidebar that covered its own toggle button on narrow viewports, and a verification results panel that silently re-collapsed on re-render because its open/closed state was not tracked per message.</w:t>
       </w:r>
     </w:p>
     <w:p>
-      <w:pPr>
-        <w:pStyle w:val="ListBullet"/>
-      </w:pPr>
-      <w:r>
-        <w:t>The ocr_confidence signal (Eq. 2) requires documents where OCR actually degrades — table, formula, and chart content (2,275+1,223+765 = 4,263 records, 50% of the benchmark) is exactly where document parsing and OCR historically fail hardest, which is the specific reason OHR-Bench's own authors built it around this evidence_source taxonomy in the first place, rather than sampling uniformly from clean prose.</w:t>
+      <w:r>
+        <w:t>9 new unit tests (claim extraction, attribution parsing including multi-chunk-id and malformed-line tolerance, lineage assembly, counterfactual-sensitivity detection -- judge mocked, deterministic, no Ollama required) plus 5 new integration tests (the full /verify loop against a real backend, the 404/409 error paths, and the restart-recovery regression) bring the project's full suite to 91 passed, 1 skipped, confirmed again by a fresh run from the consolidated project folder (Section 6's deployment discussion).</w:t>
       </w:r>
     </w:p>
     <w:p>
       <w:pPr>
-        <w:pStyle w:val="ListBullet"/>
-      </w:pPr>
-      <w:r>
-        <w:t>The agreement signal (Eq. 1) benefits from queries with genuine lexical/semantic retrieval tension — OHR-Bench's domain variety (legal clause language vs. conversational newspaper prose vs. terse manual instructions) produces a wider range of BM25-vs-dense agreement behavior than a single-domain benchmark would, which is necessary for the calibration split to observe enough variation in this signal to fit a non-degenerate weight on it.</w:t>
-      </w:r>
-    </w:p>
-    <w:p>
-      <w:pPr>
-        <w:pStyle w:val="ListBullet"/>
-      </w:pPr>
-      <w:r>
-        <w:t>Crucially, OHR-Bench additionally ships genuine OCR-perturbed variants of its own ground truth — formatting_noise and semantic_noise sets, each at mild/moderate/severe severity, generated by three real OCR/VLM parsing systems (GOT, MinerU, Qwen2.5-VL-72B) rather than synthetic image corruption. This paper's OCR-robustness study (Section 5.4) does NOT yet use these native perturbed variants — it instead renders clean ground-truth text to images and applies synthetic corruption (blur, resolution loss, skew, JPEG compression, noise, contrast reduction) through the project's own OCR pipeline. This is stated explicitly as a limitation (Section 7): OHR-Bench's own real-OCR-engine-perturbed data would be a strictly stronger test of the ocr_confidence signal than this paper's synthetic degradation, and switching to it is a concrete, scoped, low-effort follow-up — the perturbed files already exist in the benchmark distribution and require no new data collection.</w:t>
-      </w:r>
-    </w:p>
-    <w:p>
-      <w:pPr>
         <w:pStyle w:val="Heading3"/>
       </w:pPr>
       <w:r>
-        <w:t>4.1.3 Why not the alternatives</w:t>
+        <w:t>3.8.2 What was explicitly deferred, and why</w:t>
       </w:r>
     </w:p>
     <w:p>
@@ -1457,6 +1429,397 @@
           <w:sz w:val="19"/>
         </w:rPr>
         <w:t xml:space="preserve">Table 1. </w:t>
+      </w:r>
+      <w:r>
+        <w:rPr>
+          <w:i/>
+          <w:color w:val="6B7280"/>
+          <w:sz w:val="19"/>
+        </w:rPr>
+        <w:t>EICV-RAG scope: built vs. explicitly deferred.</w:t>
+      </w:r>
+    </w:p>
+    <w:tbl>
+      <w:tblPr>
+        <w:tblStyle w:val="LightGrid-Accent1"/>
+        <w:tblW w:type="auto" w:w="0"/>
+        <w:jc w:val="center"/>
+        <w:tblLook w:firstColumn="1" w:firstRow="1" w:lastColumn="0" w:lastRow="0" w:noHBand="0" w:noVBand="1" w:val="04A0"/>
+      </w:tblPr>
+      <w:tblGrid>
+        <w:gridCol w:w="3024"/>
+        <w:gridCol w:w="3024"/>
+        <w:gridCol w:w="3024"/>
+      </w:tblGrid>
+      <w:tr>
+        <w:tc>
+          <w:tcPr>
+            <w:tcW w:type="dxa" w:w="3024"/>
+            <w:shd w:val="clear" w:fill="6C5CE7"/>
+          </w:tcPr>
+          <w:p>
+            <w:r/>
+            <w:r>
+              <w:rPr>
+                <w:b/>
+                <w:color w:val="FFFFFF"/>
+                <w:sz w:val="19"/>
+              </w:rPr>
+              <w:t>Specified component</w:t>
+            </w:r>
+          </w:p>
+        </w:tc>
+        <w:tc>
+          <w:tcPr>
+            <w:tcW w:type="dxa" w:w="3024"/>
+            <w:shd w:val="clear" w:fill="6C5CE7"/>
+          </w:tcPr>
+          <w:p>
+            <w:r/>
+            <w:r>
+              <w:rPr>
+                <w:b/>
+                <w:color w:val="FFFFFF"/>
+                <w:sz w:val="19"/>
+              </w:rPr>
+              <w:t>Status</w:t>
+            </w:r>
+          </w:p>
+        </w:tc>
+        <w:tc>
+          <w:tcPr>
+            <w:tcW w:type="dxa" w:w="3024"/>
+            <w:shd w:val="clear" w:fill="6C5CE7"/>
+          </w:tcPr>
+          <w:p>
+            <w:r/>
+            <w:r>
+              <w:rPr>
+                <w:b/>
+                <w:color w:val="FFFFFF"/>
+                <w:sz w:val="19"/>
+              </w:rPr>
+              <w:t>Why</w:t>
+            </w:r>
+          </w:p>
+        </w:tc>
+      </w:tr>
+      <w:tr>
+        <w:tc>
+          <w:tcPr>
+            <w:tcW w:type="dxa" w:w="3024"/>
+          </w:tcPr>
+          <w:p>
+            <w:r/>
+            <w:r>
+              <w:rPr>
+                <w:sz w:val="19"/>
+              </w:rPr>
+              <w:t>Full evidence-lineage graph database (cell-level provenance, bounding boxes, transformation history)</w:t>
+            </w:r>
+          </w:p>
+        </w:tc>
+        <w:tc>
+          <w:tcPr>
+            <w:tcW w:type="dxa" w:w="3024"/>
+          </w:tcPr>
+          <w:p>
+            <w:r/>
+            <w:r>
+              <w:rPr>
+                <w:sz w:val="19"/>
+              </w:rPr>
+              <w:t>Not built</w:t>
+            </w:r>
+          </w:p>
+        </w:tc>
+        <w:tc>
+          <w:tcPr>
+            <w:tcW w:type="dxa" w:w="3024"/>
+          </w:tcPr>
+          <w:p>
+            <w:r/>
+            <w:r>
+              <w:rPr>
+                <w:sz w:val="19"/>
+              </w:rPr>
+              <w:t>A lighter-weight schema was explicitly permitted as an alternative; no genuine bounding-box or cell-level data exists in the current extraction pipeline to populate a graph schema honestly</w:t>
+            </w:r>
+          </w:p>
+        </w:tc>
+      </w:tr>
+      <w:tr>
+        <w:tc>
+          <w:tcPr>
+            <w:tcW w:type="dxa" w:w="3024"/>
+          </w:tcPr>
+          <w:p>
+            <w:r/>
+            <w:r>
+              <w:rPr>
+                <w:sz w:val="19"/>
+              </w:rPr>
+              <w:t>Counterfactual tests 2-7 (masking, replacement, distractor injection, OCR perturbation, citation substitution, redundancy controls)</w:t>
+            </w:r>
+          </w:p>
+        </w:tc>
+        <w:tc>
+          <w:tcPr>
+            <w:tcW w:type="dxa" w:w="3024"/>
+          </w:tcPr>
+          <w:p>
+            <w:r/>
+            <w:r>
+              <w:rPr>
+                <w:sz w:val="19"/>
+              </w:rPr>
+              <w:t>Not built</w:t>
+            </w:r>
+          </w:p>
+        </w:tc>
+        <w:tc>
+          <w:tcPr>
+            <w:tcW w:type="dxa" w:w="3024"/>
+          </w:tcPr>
+          <w:p>
+            <w:r/>
+            <w:r>
+              <w:rPr>
+                <w:sz w:val="19"/>
+              </w:rPr>
+              <w:t>Test 1 alone required three new judge-call types; each remaining test is comparable scope, named as a follow-up rather than dropped silently</w:t>
+            </w:r>
+          </w:p>
+        </w:tc>
+      </w:tr>
+      <w:tr>
+        <w:tc>
+          <w:tcPr>
+            <w:tcW w:type="dxa" w:w="3024"/>
+          </w:tcPr>
+          <w:p>
+            <w:r/>
+            <w:r>
+              <w:rPr>
+                <w:sz w:val="19"/>
+              </w:rPr>
+              <w:t>10-signal learned claim-integrity score, 5 compared model variants</w:t>
+            </w:r>
+          </w:p>
+        </w:tc>
+        <w:tc>
+          <w:tcPr>
+            <w:tcW w:type="dxa" w:w="3024"/>
+          </w:tcPr>
+          <w:p>
+            <w:r/>
+            <w:r>
+              <w:rPr>
+                <w:sz w:val="19"/>
+              </w:rPr>
+              <w:t>Not built</w:t>
+            </w:r>
+          </w:p>
+        </w:tc>
+        <w:tc>
+          <w:tcPr>
+            <w:tcW w:type="dxa" w:w="3024"/>
+          </w:tcPr>
+          <w:p>
+            <w:r/>
+            <w:r>
+              <w:rPr>
+                <w:sz w:val="19"/>
+              </w:rPr>
+              <w:t>Would require the same document-disjoint calibration/evaluation infrastructure EAR already uses (Section 4.2) -- reusing it correctly for a second, different target is real follow-up work, not shortcut here</w:t>
+            </w:r>
+          </w:p>
+        </w:tc>
+      </w:tr>
+      <w:tr>
+        <w:tc>
+          <w:tcPr>
+            <w:tcW w:type="dxa" w:w="3024"/>
+          </w:tcPr>
+          <w:p>
+            <w:r/>
+            <w:r>
+              <w:rPr>
+                <w:sz w:val="19"/>
+              </w:rPr>
+              <w:t>Adaptive verification-budget optimizer</w:t>
+            </w:r>
+          </w:p>
+        </w:tc>
+        <w:tc>
+          <w:tcPr>
+            <w:tcW w:type="dxa" w:w="3024"/>
+          </w:tcPr>
+          <w:p>
+            <w:r/>
+            <w:r>
+              <w:rPr>
+                <w:sz w:val="19"/>
+              </w:rPr>
+              <w:t>Partial</w:t>
+            </w:r>
+          </w:p>
+        </w:tc>
+        <w:tc>
+          <w:tcPr>
+            <w:tcW w:type="dxa" w:w="3024"/>
+          </w:tcPr>
+          <w:p>
+            <w:r/>
+            <w:r>
+              <w:rPr>
+                <w:sz w:val="19"/>
+              </w:rPr>
+              <w:t>Present only as a design principle (opt-in verification per query); a formal cost/latency-aware policy needs usage data (call frequency, cost) not yet collected</w:t>
+            </w:r>
+          </w:p>
+        </w:tc>
+      </w:tr>
+      <w:tr>
+        <w:tc>
+          <w:tcPr>
+            <w:tcW w:type="dxa" w:w="3024"/>
+          </w:tcPr>
+          <w:p>
+            <w:r/>
+            <w:r>
+              <w:rPr>
+                <w:sz w:val="19"/>
+              </w:rPr>
+              <w:t>14 baseline/ablation configurations; 30-scenario adversarial suite; Playwright E2E automation</w:t>
+            </w:r>
+          </w:p>
+        </w:tc>
+        <w:tc>
+          <w:tcPr>
+            <w:tcW w:type="dxa" w:w="3024"/>
+          </w:tcPr>
+          <w:p>
+            <w:r/>
+            <w:r>
+              <w:rPr>
+                <w:sz w:val="19"/>
+              </w:rPr>
+              <w:t>Not run</w:t>
+            </w:r>
+          </w:p>
+        </w:tc>
+        <w:tc>
+          <w:tcPr>
+            <w:tcW w:type="dxa" w:w="3024"/>
+          </w:tcPr>
+          <w:p>
+            <w:r/>
+            <w:r>
+              <w:rPr>
+                <w:sz w:val="19"/>
+              </w:rPr>
+              <w:t>No comparative benchmark was executed for the claim-verification layer itself; correctness was verified manually and via unit/integration tests, not comparative accuracy against alternatives</w:t>
+            </w:r>
+          </w:p>
+        </w:tc>
+      </w:tr>
+    </w:tbl>
+    <w:p/>
+    <w:p>
+      <w:r>
+        <w:t>This section exists specifically so this paper does not implicitly overstate EICV-RAG's scope by omission -- the full docs/production/EICV_RAG.md carries the same table with additional detail and is the authoritative source if the two ever diverge.</w:t>
+      </w:r>
+    </w:p>
+    <w:p>
+      <w:pPr>
+        <w:pStyle w:val="Heading1"/>
+      </w:pPr>
+      <w:r>
+        <w:t>4. Experimental Setup</w:t>
+      </w:r>
+    </w:p>
+    <w:p>
+      <w:pPr>
+        <w:pStyle w:val="Heading2"/>
+      </w:pPr>
+      <w:r>
+        <w:t>4.1 Dataset</w:t>
+      </w:r>
+    </w:p>
+    <w:p>
+      <w:r>
+        <w:t>QuIM-RAG's own evaluation corpus (22,609 GPT-3.5-generated questions over a scraped NDSU university-catalog and career-advising corpus) is private with no public release, no code repository, and no stated data license — confirmed unreachable, not merely assumed, during this project's audit of the original paper (Section 2). A substitute public benchmark is therefore required for any retrieval- or selective-prediction-level claim in this paper, and the choice of substitute is not incidental: it determines what can and cannot be tested about EAR's four signals. We selected OHR-Bench (Zhang et al., arXiv:2412.02592, ICCV 2025) over four other candidates for reasons specific to what each of EAR's signals needs to be exercised meaningfully, not merely because it is a convenient, well-known benchmark.</w:t>
+      </w:r>
+    </w:p>
+    <w:p>
+      <w:pPr>
+        <w:pStyle w:val="Heading3"/>
+      </w:pPr>
+      <w:r>
+        <w:t>4.1.1 What OHR-Bench actually contains</w:t>
+      </w:r>
+    </w:p>
+    <w:p>
+      <w:r>
+        <w:t>OHR-Bench ships 8,500+ unstructured PDF pages across 7 domains (Textbook, Law, Finance, Newspaper, Manual, Academic, Administration), each page paired with human-verified ground-truth structured text, and 8,498 question-answer pairs (file qas_v2.json) drawn from 1,117 unique source documents. Each QA record carries an evidence_source field tagging which of five OCR-difficulty categories the question's supporting evidence comes from — plain text (3,409 records, 40%), table (2,275, 27%), formula (1,223, 14%), chart (765, 9%), or reading-order-dependent content (691, 8%) — and an answer_form field, of which 2,980 records (35%) are Numeric. This paper uses six of the seven domains (law, finance, textbook, manual, academic, news), substituting "academic" for the original sampling plan's "paper" label after confirming qas_v2.json's own taxonomy has zero records under "paper" (Section 3.3); "administration" is available but not used, to keep the domain-set size comparable to prior work's six-domain design.</w:t>
+      </w:r>
+    </w:p>
+    <w:p>
+      <w:pPr>
+        <w:pStyle w:val="Heading3"/>
+      </w:pPr>
+      <w:r>
+        <w:t>4.1.2 Why this schema matters for EAR specifically, not just as a generic QA benchmark</w:t>
+      </w:r>
+    </w:p>
+    <w:p>
+      <w:pPr>
+        <w:pStyle w:val="ListBullet"/>
+      </w:pPr>
+      <w:r>
+        <w:t>The contradiction signal (Eq. 4) extracts and compares numbers across evidence chunks — it has essentially nothing to detect on a benchmark without numeric content. OHR-Bench's 2,980 Numeric-answer records and 2,275 table-evidence records (table rows are a dense source of the kind of near-duplicate, easily-transposed figures this signal targets) give it real material to work with; a benchmark like SQuAD, built from prose Wikipedia passages, would not.</w:t>
+      </w:r>
+    </w:p>
+    <w:p>
+      <w:pPr>
+        <w:pStyle w:val="ListBullet"/>
+      </w:pPr>
+      <w:r>
+        <w:t>The ocr_confidence signal (Eq. 2) requires documents where OCR actually degrades — table, formula, and chart content (2,275+1,223+765 = 4,263 records, 50% of the benchmark) is exactly where document parsing and OCR historically fail hardest, which is the specific reason OHR-Bench's own authors built it around this evidence_source taxonomy in the first place, rather than sampling uniformly from clean prose.</w:t>
+      </w:r>
+    </w:p>
+    <w:p>
+      <w:pPr>
+        <w:pStyle w:val="ListBullet"/>
+      </w:pPr>
+      <w:r>
+        <w:t>The agreement signal (Eq. 1) benefits from queries with genuine lexical/semantic retrieval tension — OHR-Bench's domain variety (legal clause language vs. conversational newspaper prose vs. terse manual instructions) produces a wider range of BM25-vs-dense agreement behavior than a single-domain benchmark would, which is necessary for the calibration split to observe enough variation in this signal to fit a non-degenerate weight on it.</w:t>
+      </w:r>
+    </w:p>
+    <w:p>
+      <w:pPr>
+        <w:pStyle w:val="ListBullet"/>
+      </w:pPr>
+      <w:r>
+        <w:t>Crucially, OHR-Bench additionally ships genuine OCR-perturbed variants of its own ground truth — formatting_noise and semantic_noise sets, each at mild/moderate/severe severity, generated by three real OCR/VLM parsing systems (GOT, MinerU, Qwen2.5-VL-72B) rather than synthetic image corruption. This paper's OCR-robustness study (Section 5.4) does NOT yet use these native perturbed variants — it instead renders clean ground-truth text to images and applies synthetic corruption (blur, resolution loss, skew, JPEG compression, noise, contrast reduction) through the project's own OCR pipeline. This is stated explicitly as a limitation (Section 7): OHR-Bench's own real-OCR-engine-perturbed data would be a strictly stronger test of the ocr_confidence signal than this paper's synthetic degradation, and switching to it is a concrete, scoped, low-effort follow-up — the perturbed files already exist in the benchmark distribution and require no new data collection.</w:t>
+      </w:r>
+    </w:p>
+    <w:p>
+      <w:pPr>
+        <w:pStyle w:val="Heading3"/>
+      </w:pPr>
+      <w:r>
+        <w:t>4.1.3 Why not the alternatives</w:t>
+      </w:r>
+    </w:p>
+    <w:p>
+      <w:r>
+        <w:rPr>
+          <w:b/>
+          <w:sz w:val="19"/>
+        </w:rPr>
+        <w:t xml:space="preserve">Table 2. </w:t>
       </w:r>
       <w:r>
         <w:rPr>
@@ -2201,7 +2564,7 @@
           <w:b/>
           <w:sz w:val="19"/>
         </w:rPr>
-        <w:t xml:space="preserve">Table 2. </w:t>
+        <w:t xml:space="preserve">Table 3. </w:t>
       </w:r>
       <w:r>
         <w:rPr>
@@ -2670,7 +3033,7 @@
           <w:b/>
           <w:sz w:val="19"/>
         </w:rPr>
-        <w:t xml:space="preserve">Table 3. </w:t>
+        <w:t xml:space="preserve">Table 4. </w:t>
       </w:r>
       <w:r>
         <w:rPr>
@@ -2923,7 +3286,7 @@
           <w:color w:val="6B7280"/>
           <w:sz w:val="19"/>
         </w:rPr>
-        <w:t>McNemar's test on narrow top-1 correctness does NOT find a significant difference (p=0.256), while the paired bootstrap on nDCG@5 (Table 2) DOES (p=0.008). These are not contradictory — they test different things. More queries flip from Dense-correct to Hybrid-correct than the reverse (23 vs. 15, a 1.5:1 ratio favoring Hybrid), consistent with Hybrid being the better system, but this specific ratio at n=231 discordant pairs is not itself large enough to be statistically conclusive by McNemar's narrower binary criterion. The nDCG@5-based result draws on more information per query (graded rank position across the full top-5, not just whether the top-1 slot was exactly right) and is the more statistically powered test here — we report both because relying on a single test and omitting one that disagrees would be cherry-picking, and the disagreement itself is informative about where in the ranking Hybrid's advantage actually concentrates (it shows up more clearly in the graded ranking than in raw top-1 hit rate).</w:t>
+        <w:t>McNemar's test on narrow top-1 correctness does NOT find a significant difference (p=0.256), while the paired bootstrap on nDCG@5 (Table 3) DOES (p=0.008). These are not contradictory — they test different things. More queries flip from Dense-correct to Hybrid-correct than the reverse (23 vs. 15, a 1.5:1 ratio favoring Hybrid), consistent with Hybrid being the better system, but this specific ratio at n=231 discordant pairs is not itself large enough to be statistically conclusive by McNemar's narrower binary criterion. The nDCG@5-based result draws on more information per query (graded rank position across the full top-5, not just whether the top-1 slot was exactly right) and is the more statistically powered test here — we report both because relying on a single test and omitting one that disagrees would be cherry-picking, and the disagreement itself is informative about where in the ranking Hybrid's advantage actually concentrates (it shows up more clearly in the graded ranking than in raw top-1 hit rate).</w:t>
       </w:r>
     </w:p>
     <w:p>
@@ -2940,7 +3303,7 @@
           <w:b/>
           <w:sz w:val="19"/>
         </w:rPr>
-        <w:t xml:space="preserve">Table 4. </w:t>
+        <w:t xml:space="preserve">Table 5. </w:t>
       </w:r>
       <w:r>
         <w:rPr>
@@ -3383,7 +3746,7 @@
           <w:b/>
           <w:sz w:val="19"/>
         </w:rPr>
-        <w:t xml:space="preserve">Table 5. </w:t>
+        <w:t xml:space="preserve">Table 6. </w:t>
       </w:r>
       <w:r>
         <w:rPr>
@@ -3750,7 +4113,7 @@
           <w:b/>
           <w:sz w:val="19"/>
         </w:rPr>
-        <w:t xml:space="preserve">Table 6. </w:t>
+        <w:t xml:space="preserve">Table 7. </w:t>
       </w:r>
       <w:r>
         <w:rPr>
@@ -4087,7 +4450,7 @@
           <w:b/>
           <w:sz w:val="19"/>
         </w:rPr>
-        <w:t xml:space="preserve">Table 7. </w:t>
+        <w:t xml:space="preserve">Table 8. </w:t>
       </w:r>
       <w:r>
         <w:rPr>
@@ -4381,7 +4744,7 @@
           <w:b/>
           <w:sz w:val="19"/>
         </w:rPr>
-        <w:t xml:space="preserve">Table 8. </w:t>
+        <w:t xml:space="preserve">Table 9. </w:t>
       </w:r>
       <w:r>
         <w:rPr>
@@ -4597,7 +4960,7 @@
           <w:b/>
           <w:sz w:val="19"/>
         </w:rPr>
-        <w:t xml:space="preserve">Table 9. </w:t>
+        <w:t xml:space="preserve">Table 10. </w:t>
       </w:r>
       <w:r>
         <w:rPr>
@@ -4946,7 +5309,7 @@
           <w:b/>
           <w:sz w:val="19"/>
         </w:rPr>
-        <w:t xml:space="preserve">Table 10. </w:t>
+        <w:t xml:space="preserve">Table 11. </w:t>
       </w:r>
       <w:r>
         <w:rPr>
@@ -5160,7 +5523,7 @@
           <w:b/>
           <w:sz w:val="19"/>
         </w:rPr>
-        <w:t xml:space="preserve">Table 11. </w:t>
+        <w:t xml:space="preserve">Table 12. </w:t>
       </w:r>
       <w:r>
         <w:rPr>
@@ -5855,6 +6218,11 @@
       </w:r>
     </w:p>
     <w:p>
+      <w:r>
+        <w:t>This revision also adds EICV-RAG (Section 3.8), a claim-level evidence verification layer on top of the production backend: per-claim attribution to specific evidence chunks (a strict superset of citation-marker checking), one real counterfactual test (evidence deletion, with an observed genuine SUPPORTED-to-UNSUPPORTED flip), a persisted, independently re-inspectable audit trail, and a rebuilt single-page frontend verified by actually driving it end-to-end rather than only reading its source. As with every other component in this paper, EICV-RAG's scope is reported honestly as built-vs-deferred (Table 1) rather than claimed in full against its much larger originating brief. Finally, the entire project — backend, frontend, research pipeline, and this paper's own build scripts — was consolidated into a single, independent, git-tracked project folder with its own virtual environment, verified to install and pass its full test suite (91 passed, 1 skipped) from a clean checkout, and pushed to a public GitHub repository, so that the system described in this paper is something a reader can actually clone, run locally, and inspect, not only a description of one.</w:t>
+      </w:r>
+    </w:p>
+    <w:p>
       <w:pPr>
         <w:pStyle w:val="Heading1"/>
       </w:pPr>

</xml_diff>